<commit_message>
Requisitos + Utilidad json.rs
Actualizamos los documentos de requisitos según los comentarios del tutor.
Creamos un nuevo módulo para evitar la dependencia serde.
Los experimentos ahora no tienen observadores, generan un archivo json. Esto se mejorará no me gusta.
Lógica de algorithm.run pasada a runtime.
</commit_message>
<xml_diff>
--- a/docs/requirements/Requisitos TFG.docx
+++ b/docs/requirements/Requisitos TFG.docx
@@ -222,12 +222,12 @@
             <wp:extent cx="2465769" cy="2465769"/>
             <wp:effectExtent b="0" l="0" r="0" t="0"/>
             <wp:wrapNone/>
-            <wp:docPr id="1" name="image2.png"/>
+            <wp:docPr id="1" name="image1.png"/>
             <a:graphic>
               <a:graphicData uri="http://schemas.openxmlformats.org/drawingml/2006/picture">
                 <pic:pic>
                   <pic:nvPicPr>
-                    <pic:cNvPr id="0" name="image2.png"/>
+                    <pic:cNvPr id="0" name="image1.png"/>
                     <pic:cNvPicPr preferRelativeResize="0"/>
                   </pic:nvPicPr>
                   <pic:blipFill>
@@ -514,7 +514,7 @@
     </w:p>
     <w:sdt>
       <w:sdtPr>
-        <w:id w:val="-1331637145"/>
+        <w:id w:val="-1602938076"/>
         <w:docPartObj>
           <w:docPartGallery w:val="Table of Contents"/>
           <w:docPartUnique w:val="1"/>
@@ -2441,7 +2441,7 @@
         <w:rPr>
           <w:rtl w:val="0"/>
         </w:rPr>
-        <w:t xml:space="preserve">El sistema debe ser capaz de manejar diferentes tipos de variables: continuas (reales), discretas (enteros) y combinatorias (permutaciones).</w:t>
+        <w:t xml:space="preserve">El sistema debe ser capaz de manejar diferentes tipos de variables: continuas (reales), discretas (binarias y enteras) y otras variantes (mixtas y permutaciones).</w:t>
       </w:r>
     </w:p>
     <w:p>
@@ -2590,7 +2590,7 @@
         <w:rPr>
           <w:rtl w:val="0"/>
         </w:rPr>
-        <w:t xml:space="preserve">El sistema debe permitir al usuario elegir entre un catálogo de algoritmos implementados (ej. Algoritmos Genéticos, Recocido Simulado, Enjambre de Partículas).</w:t>
+        <w:t xml:space="preserve">El sistema debe permitir al usuario elegir entre un catálogo de algoritmos implementados (p. ej. Algoritmos Genéticos, Recocido Simulado o Enjambre de Partículas).</w:t>
       </w:r>
     </w:p>
     <w:p>
@@ -2616,7 +2616,7 @@
         <w:rPr>
           <w:rtl w:val="0"/>
         </w:rPr>
-        <w:t xml:space="preserve">El sistema debe permitir la parametrización de cada algoritmo (ej. tamaño de población, tasa de mutación, temperatura inicial, número de iteraciones).</w:t>
+        <w:t xml:space="preserve">El sistema debe permitir la parametrización de cada algoritmo (p. ej. tamaño de población, tasa de mutación, temperatura inicial o número de iteraciones).</w:t>
       </w:r>
     </w:p>
     <w:p>
@@ -2657,7 +2657,21 @@
         <w:rPr>
           <w:rtl w:val="0"/>
         </w:rPr>
-        <w:t xml:space="preserve">RF-08: Determinismo y Control de Semillas (Seeding):</w:t>
+        <w:t xml:space="preserve">RF-08: Determinismo y Control de Semillas (</w:t>
+      </w:r>
+      <w:r>
+        <w:rPr>
+          <w:i w:val="1"/>
+          <w:iCs w:val="1"/>
+          <w:rtl w:val="0"/>
+        </w:rPr>
+        <w:t xml:space="preserve">Seeding</w:t>
+      </w:r>
+      <w:r>
+        <w:rPr>
+          <w:rtl w:val="0"/>
+        </w:rPr>
+        <w:t xml:space="preserve">):</w:t>
       </w:r>
     </w:p>
     <w:p>
@@ -2689,7 +2703,21 @@
         <w:rPr>
           <w:rtl w:val="0"/>
         </w:rPr>
-        <w:t xml:space="preserve">Con el fin de garantizar la reproducibilidad de los resultados, el sistema deberá permitir al usuario definir una semilla (seed) para el generador de números pseudoaleatorios. De este modo, utilizando la misma semilla y las mismas condiciones de entrada, el algoritmo producirá siempre los mismos resultados, facilitando así la validación, comparación y análisis experimental.</w:t>
+        <w:t xml:space="preserve">Con el fin de garantizar la reproducibilidad de los resultados, el sistema deberá permitir al usuario definir una semilla (</w:t>
+      </w:r>
+      <w:r>
+        <w:rPr>
+          <w:i w:val="1"/>
+          <w:iCs w:val="1"/>
+          <w:rtl w:val="0"/>
+        </w:rPr>
+        <w:t xml:space="preserve">seed</w:t>
+      </w:r>
+      <w:r>
+        <w:rPr>
+          <w:rtl w:val="0"/>
+        </w:rPr>
+        <w:t xml:space="preserve">) para el generador de números pseudoaleatorios. De este modo, utilizando la misma semilla y las mismas condiciones de entrada, el algoritmo producirá siempre los mismos resultados, facilitando así la validación, comparación y análisis experimental.</w:t>
       </w:r>
     </w:p>
     <w:p>
@@ -6172,12 +6200,12 @@
           <wp:extent cx="1795463" cy="524701"/>
           <wp:effectExtent b="0" l="0" r="0" t="0"/>
           <wp:wrapNone/>
-          <wp:docPr id="2" name="image1.png"/>
+          <wp:docPr id="2" name="image2.png"/>
           <a:graphic>
             <a:graphicData uri="http://schemas.openxmlformats.org/drawingml/2006/picture">
               <pic:pic>
                 <pic:nvPicPr>
-                  <pic:cNvPr id="0" name="image1.png"/>
+                  <pic:cNvPr id="0" name="image2.png"/>
                   <pic:cNvPicPr preferRelativeResize="0"/>
                 </pic:nvPicPr>
                 <pic:blipFill>

</xml_diff>

<commit_message>
JSON + YAML + Bug Experimento
Ejemplo que prueba CSV, JSON y YAML.

El caso de experimento de hill climbing no usaba correctamente sus parámetros
</commit_message>
<xml_diff>
--- a/docs/requirements/Requisitos TFG.docx
+++ b/docs/requirements/Requisitos TFG.docx
@@ -514,7 +514,7 @@
     </w:p>
     <w:sdt>
       <w:sdtPr>
-        <w:id w:val="-1602938076"/>
+        <w:id w:val="783400266"/>
         <w:docPartObj>
           <w:docPartGallery w:val="Table of Contents"/>
           <w:docPartUnique w:val="1"/>
@@ -3092,45 +3092,6 @@
     </w:p>
     <w:p>
       <w:pPr>
-        <w:pStyle w:val="Heading2"/>
-        <w:rPr/>
-      </w:pPr>
-      <w:bookmarkStart w:colFirst="0" w:colLast="0" w:name="_fy1hx448pycy" w:id="18"/>
-      <w:bookmarkEnd w:id="18"/>
-      <w:r>
-        <w:rPr>
-          <w:rtl w:val="0"/>
-        </w:rPr>
-        <w:t xml:space="preserve">RF-16: Serializable:</w:t>
-      </w:r>
-    </w:p>
-    <w:p>
-      <w:pPr>
-        <w:rPr/>
-      </w:pPr>
-      <w:r>
-        <w:rPr>
-          <w:rtl w:val="0"/>
-        </w:rPr>
-        <w:t xml:space="preserve">Todas las estructuras deben poder implementar los traits de </w:t>
-      </w:r>
-      <w:r>
-        <w:rPr>
-          <w:i w:val="1"/>
-          <w:iCs w:val="1"/>
-          <w:rtl w:val="0"/>
-        </w:rPr>
-        <w:t xml:space="preserve">serde</w:t>
-      </w:r>
-      <w:r>
-        <w:rPr>
-          <w:rtl w:val="0"/>
-        </w:rPr>
-        <w:t xml:space="preserve">, para que estas sean serializables.</w:t>
-      </w:r>
-    </w:p>
-    <w:p>
-      <w:pPr>
         <w:rPr/>
       </w:pPr>
       <w:r>
@@ -3152,13 +3113,38 @@
           <w:szCs w:val="40"/>
         </w:rPr>
       </w:pPr>
-      <w:bookmarkStart w:colFirst="0" w:colLast="0" w:name="_x2uv5wulkfzo" w:id="19"/>
+      <w:bookmarkStart w:colFirst="0" w:colLast="0" w:name="_x2uv5wulkfzo" w:id="18"/>
+      <w:bookmarkEnd w:id="18"/>
+      <w:r>
+        <w:rPr>
+          <w:rtl w:val="0"/>
+        </w:rPr>
+        <w:t xml:space="preserve">Requisitos no funcionales</w:t>
+      </w:r>
+    </w:p>
+    <w:p>
+      <w:pPr>
+        <w:pStyle w:val="Heading2"/>
+        <w:rPr/>
+      </w:pPr>
+      <w:bookmarkStart w:colFirst="0" w:colLast="0" w:name="_onnrav51o5ji" w:id="19"/>
       <w:bookmarkEnd w:id="19"/>
       <w:r>
         <w:rPr>
           <w:rtl w:val="0"/>
         </w:rPr>
-        <w:t xml:space="preserve">Requisitos no funcionales</w:t>
+        <w:t xml:space="preserve">RNF-01: Desarrollo nativo en Rust:</w:t>
+      </w:r>
+    </w:p>
+    <w:p>
+      <w:pPr>
+        <w:rPr/>
+      </w:pPr>
+      <w:r>
+        <w:rPr>
+          <w:rtl w:val="0"/>
+        </w:rPr>
+        <w:t xml:space="preserve">La biblioteca debe estar desarrollada 100% en el lenguaje de programación Rust.</w:t>
       </w:r>
     </w:p>
     <w:p>
@@ -3166,33 +3152,8 @@
         <w:pStyle w:val="Heading2"/>
         <w:rPr/>
       </w:pPr>
-      <w:bookmarkStart w:colFirst="0" w:colLast="0" w:name="_onnrav51o5ji" w:id="20"/>
+      <w:bookmarkStart w:colFirst="0" w:colLast="0" w:name="_hmq4p6kzjq8y" w:id="20"/>
       <w:bookmarkEnd w:id="20"/>
-      <w:r>
-        <w:rPr>
-          <w:rtl w:val="0"/>
-        </w:rPr>
-        <w:t xml:space="preserve">RNF-01: Desarrollo nativo en Rust:</w:t>
-      </w:r>
-    </w:p>
-    <w:p>
-      <w:pPr>
-        <w:rPr/>
-      </w:pPr>
-      <w:r>
-        <w:rPr>
-          <w:rtl w:val="0"/>
-        </w:rPr>
-        <w:t xml:space="preserve">La biblioteca debe estar desarrollada 100% en el lenguaje de programación Rust.</w:t>
-      </w:r>
-    </w:p>
-    <w:p>
-      <w:pPr>
-        <w:pStyle w:val="Heading2"/>
-        <w:rPr/>
-      </w:pPr>
-      <w:bookmarkStart w:colFirst="0" w:colLast="0" w:name="_hmq4p6kzjq8y" w:id="21"/>
-      <w:bookmarkEnd w:id="21"/>
       <w:r>
         <w:rPr>
           <w:rtl w:val="0"/>
@@ -3230,24 +3191,49 @@
         <w:pStyle w:val="Heading2"/>
         <w:rPr/>
       </w:pPr>
-      <w:bookmarkStart w:colFirst="0" w:colLast="0" w:name="_hxnucg22k8jf" w:id="22"/>
+      <w:bookmarkStart w:colFirst="0" w:colLast="0" w:name="_hxnucg22k8jf" w:id="21"/>
+      <w:bookmarkEnd w:id="21"/>
+      <w:r>
+        <w:rPr>
+          <w:rtl w:val="0"/>
+        </w:rPr>
+        <w:t xml:space="preserve">RNF-03: Documentación exhaustiva:</w:t>
+      </w:r>
+    </w:p>
+    <w:p>
+      <w:pPr>
+        <w:rPr/>
+      </w:pPr>
+      <w:r>
+        <w:rPr>
+          <w:rtl w:val="0"/>
+        </w:rPr>
+        <w:t xml:space="preserve">El código debe tener una documentación clara y concisa.</w:t>
+      </w:r>
+    </w:p>
+    <w:p>
+      <w:pPr>
+        <w:pStyle w:val="Heading2"/>
+        <w:rPr/>
+      </w:pPr>
+      <w:bookmarkStart w:colFirst="0" w:colLast="0" w:name="_uyl5xqazh4k5" w:id="22"/>
       <w:bookmarkEnd w:id="22"/>
       <w:r>
         <w:rPr>
           <w:rtl w:val="0"/>
         </w:rPr>
-        <w:t xml:space="preserve">RNF-03: Documentación exhaustiva:</w:t>
-      </w:r>
-    </w:p>
-    <w:p>
-      <w:pPr>
-        <w:rPr/>
-      </w:pPr>
-      <w:r>
-        <w:rPr>
-          <w:rtl w:val="0"/>
-        </w:rPr>
-        <w:t xml:space="preserve">El código debe tener una documentación clara y concisa.</w:t>
+        <w:t xml:space="preserve">RNF-04: Arquitectura modular:</w:t>
+      </w:r>
+    </w:p>
+    <w:p>
+      <w:pPr>
+        <w:rPr/>
+      </w:pPr>
+      <w:r>
+        <w:rPr>
+          <w:rtl w:val="0"/>
+        </w:rPr>
+        <w:t xml:space="preserve">El diseño debe separar claramente los componentes del sistema, permitiendo intercambiarlos sin modificar el núcleo.</w:t>
       </w:r>
     </w:p>
     <w:p>
@@ -3255,24 +3241,24 @@
         <w:pStyle w:val="Heading2"/>
         <w:rPr/>
       </w:pPr>
-      <w:bookmarkStart w:colFirst="0" w:colLast="0" w:name="_uyl5xqazh4k5" w:id="23"/>
+      <w:bookmarkStart w:colFirst="0" w:colLast="0" w:name="_9tyzh4uullhq" w:id="23"/>
       <w:bookmarkEnd w:id="23"/>
       <w:r>
         <w:rPr>
           <w:rtl w:val="0"/>
         </w:rPr>
-        <w:t xml:space="preserve">RNF-04: Arquitectura modular:</w:t>
-      </w:r>
-    </w:p>
-    <w:p>
-      <w:pPr>
-        <w:rPr/>
-      </w:pPr>
-      <w:r>
-        <w:rPr>
-          <w:rtl w:val="0"/>
-        </w:rPr>
-        <w:t xml:space="preserve">El diseño debe separar claramente los componentes del sistema, permitiendo intercambiarlos sin modificar el núcleo.</w:t>
+        <w:t xml:space="preserve">RNF-05: Simplicidad de uso:</w:t>
+      </w:r>
+    </w:p>
+    <w:p>
+      <w:pPr>
+        <w:rPr/>
+      </w:pPr>
+      <w:r>
+        <w:rPr>
+          <w:rtl w:val="0"/>
+        </w:rPr>
+        <w:t xml:space="preserve">Debe ser fácil e intuitiva la incorporación de nuevos problemas por parte del usuario.</w:t>
       </w:r>
     </w:p>
     <w:p>
@@ -3280,24 +3266,24 @@
         <w:pStyle w:val="Heading2"/>
         <w:rPr/>
       </w:pPr>
-      <w:bookmarkStart w:colFirst="0" w:colLast="0" w:name="_9tyzh4uullhq" w:id="24"/>
+      <w:bookmarkStart w:colFirst="0" w:colLast="0" w:name="_in91gfxbk3va" w:id="24"/>
       <w:bookmarkEnd w:id="24"/>
       <w:r>
         <w:rPr>
           <w:rtl w:val="0"/>
         </w:rPr>
-        <w:t xml:space="preserve">RNF-05: Simplicidad de uso:</w:t>
-      </w:r>
-    </w:p>
-    <w:p>
-      <w:pPr>
-        <w:rPr/>
-      </w:pPr>
-      <w:r>
-        <w:rPr>
-          <w:rtl w:val="0"/>
-        </w:rPr>
-        <w:t xml:space="preserve">Debe ser fácil e intuitiva la incorporación de nuevos problemas por parte del usuario.</w:t>
+        <w:t xml:space="preserve">RNF-06: Estabilidad numérica:</w:t>
+      </w:r>
+    </w:p>
+    <w:p>
+      <w:pPr>
+        <w:rPr/>
+      </w:pPr>
+      <w:r>
+        <w:rPr>
+          <w:rtl w:val="0"/>
+        </w:rPr>
+        <w:t xml:space="preserve">El sistema debe ser capaz de solventar los problemas de redondeo causados por los tipos decimales f32 y f64.</w:t>
       </w:r>
     </w:p>
     <w:p>
@@ -3305,33 +3291,8 @@
         <w:pStyle w:val="Heading2"/>
         <w:rPr/>
       </w:pPr>
-      <w:bookmarkStart w:colFirst="0" w:colLast="0" w:name="_in91gfxbk3va" w:id="25"/>
+      <w:bookmarkStart w:colFirst="0" w:colLast="0" w:name="_ynywo1mh0p6a" w:id="25"/>
       <w:bookmarkEnd w:id="25"/>
-      <w:r>
-        <w:rPr>
-          <w:rtl w:val="0"/>
-        </w:rPr>
-        <w:t xml:space="preserve">RNF-06: Estabilidad numérica:</w:t>
-      </w:r>
-    </w:p>
-    <w:p>
-      <w:pPr>
-        <w:rPr/>
-      </w:pPr>
-      <w:r>
-        <w:rPr>
-          <w:rtl w:val="0"/>
-        </w:rPr>
-        <w:t xml:space="preserve">El sistema debe ser capaz de solventar los problemas de redondeo causados por los tipos decimales f32 y f64.</w:t>
-      </w:r>
-    </w:p>
-    <w:p>
-      <w:pPr>
-        <w:pStyle w:val="Heading2"/>
-        <w:rPr/>
-      </w:pPr>
-      <w:bookmarkStart w:colFirst="0" w:colLast="0" w:name="_ynywo1mh0p6a" w:id="26"/>
-      <w:bookmarkEnd w:id="26"/>
       <w:r>
         <w:rPr>
           <w:rtl w:val="0"/>
@@ -3362,8 +3323,8 @@
           <w:szCs w:val="40"/>
         </w:rPr>
       </w:pPr>
-      <w:bookmarkStart w:colFirst="0" w:colLast="0" w:name="_randkscho4ur" w:id="27"/>
-      <w:bookmarkEnd w:id="27"/>
+      <w:bookmarkStart w:colFirst="0" w:colLast="0" w:name="_randkscho4ur" w:id="26"/>
+      <w:bookmarkEnd w:id="26"/>
       <w:r>
         <w:rPr>
           <w:rtl w:val="0"/>
@@ -3424,8 +3385,8 @@
         <w:pStyle w:val="Heading2"/>
         <w:rPr/>
       </w:pPr>
-      <w:bookmarkStart w:colFirst="0" w:colLast="0" w:name="_fzbi1zdikgee" w:id="28"/>
-      <w:bookmarkEnd w:id="28"/>
+      <w:bookmarkStart w:colFirst="0" w:colLast="0" w:name="_fzbi1zdikgee" w:id="27"/>
+      <w:bookmarkEnd w:id="27"/>
       <w:r>
         <w:rPr>
           <w:rtl w:val="0"/>
@@ -4822,8 +4783,8 @@
         <w:pStyle w:val="Heading2"/>
         <w:rPr/>
       </w:pPr>
-      <w:bookmarkStart w:colFirst="0" w:colLast="0" w:name="_ucnyttgxsjpm" w:id="29"/>
-      <w:bookmarkEnd w:id="29"/>
+      <w:bookmarkStart w:colFirst="0" w:colLast="0" w:name="_ucnyttgxsjpm" w:id="28"/>
+      <w:bookmarkEnd w:id="28"/>
       <w:r>
         <w:rPr>
           <w:rtl w:val="0"/>

</xml_diff>